<commit_message>
Ep 7: place hero image first (under the subtitle), refresh Substack doc
Substack's editor has no separate cover slot, so the hero belongs as the first
inline image under the subtitle. Added Blog-7-hero-apple-stands.png there and
regenerated the Substack Word doc (image order: hero -> scene -> screenshot).

Co-Authored-By: Claude Opus 4.8 (1M context) <noreply@anthropic.com>
</commit_message>
<xml_diff>
--- a/docs/exports/blog-episode-7-the-three-apple-stands-SUBSTACK-FINAL.docx
+++ b/docs/exports/blog-episode-7-the-three-apple-stands-SUBSTACK-FINAL.docx
@@ -24,6 +24,30 @@
           <w:i/>
         </w:rPr>
         <w:t>Marcus spent six hours building a spreadsheet to compare three "boring, real" companies. They looked nearly identical. The one number his spreadsheet didn't weigh is the one that told them apart.</w:t>
+      </w:r>
+    </w:p>
+    <w:p>
+      <w:pPr>
+        <w:jc w:val="center"/>
+      </w:pPr>
+      <w:r>
+        <w:t>⸻</w:t>
+      </w:r>
+    </w:p>
+    <w:p>
+      <w:r>
+        <w:rPr>
+          <w:b/>
+        </w:rPr>
+        <w:t>[ Image: Blog-7-hero-apple-stands.png ]</w:t>
+      </w:r>
+    </w:p>
+    <w:p>
+      <w:r>
+        <w:rPr>
+          <w:i/>
+        </w:rPr>
+        <w:t>Caption: Three apples. Same red. How do you choose?</w:t>
       </w:r>
     </w:p>
     <w:p>

</xml_diff>